<commit_message>
Actualiza el informe de evidencias (TCY0101 Eval. Parcial 2): conclusiones en texto libre y anexos con evidencia de las 5 pruebas
</commit_message>
<xml_diff>
--- a/docs/EvaluacionParcial2_TCY0101/Informe_Evidencias_Parcial2.docx
+++ b/docs/EvaluacionParcial2_TCY0101/Informe_Evidencias_Parcial2.docx
@@ -71,7 +71,7 @@
         <w:jc w:val="right"/>
       </w:pPr>
       <w:r>
-        <w:t>Apellido1, Nombre 1</w:t>
+        <w:t>Belén Lisboa</w:t>
       </w:r>
     </w:p>
     <w:p>
@@ -80,7 +80,16 @@
         <w:jc w:val="right"/>
       </w:pPr>
       <w:r>
-        <w:t>Apellido1, Nombre 1</w:t>
+        <w:t>Marco Tassara</w:t>
+      </w:r>
+    </w:p>
+    <w:p>
+      <w:pPr>
+        <w:spacing w:line="240" w:lineRule="auto"/>
+        <w:jc w:val="right"/>
+      </w:pPr>
+      <w:r>
+        <w:t>Martín Villegas</w:t>
       </w:r>
     </w:p>
     <w:p>
@@ -93,11 +102,9 @@
           <w:b/>
           <w:bCs/>
         </w:rPr>
-        <w:t>Sección:</w:t>
-      </w:r>
-      <w:r>
-        <w:t xml:space="preserve"> Siglas de la sección</w:t>
-      </w:r>
+        <w:t>Sección: TCY0101</w:t>
+      </w:r>
+      <w:r/>
     </w:p>
     <w:p>
       <w:pPr>
@@ -109,11 +116,9 @@
           <w:b/>
           <w:bCs/>
         </w:rPr>
-        <w:t>Profesor:</w:t>
-      </w:r>
-      <w:r>
-        <w:t xml:space="preserve"> Nombre del Profesor</w:t>
-      </w:r>
+        <w:t>Profesor: Christian Rodrigo Alvarez Lobos</w:t>
+      </w:r>
+      <w:r/>
     </w:p>
     <w:p>
       <w:pPr>
@@ -200,14 +205,13 @@
           <w:sz w:val="40"/>
           <w:szCs w:val="40"/>
         </w:rPr>
-        <w:t xml:space="preserve">Sistema: </w:t>
+        <w:t>Sistema: Gestor de Inventario</w:t>
       </w:r>
       <w:r>
         <w:rPr>
           <w:sz w:val="40"/>
           <w:szCs w:val="40"/>
         </w:rPr>
-        <w:t>Nombre del Sistema</w:t>
       </w:r>
     </w:p>
     <w:p>
@@ -222,14 +226,13 @@
           <w:sz w:val="32"/>
           <w:szCs w:val="32"/>
         </w:rPr>
-        <w:t>Realizado por</w:t>
+        <w:t>Realizado por: Martín Villegas</w:t>
       </w:r>
       <w:r>
         <w:rPr>
           <w:sz w:val="32"/>
           <w:szCs w:val="32"/>
         </w:rPr>
-        <w:t>: Estudiante 1</w:t>
       </w:r>
     </w:p>
     <w:tbl>
@@ -244,6 +247,10 @@
         <w:gridCol w:w="2944"/>
       </w:tblGrid>
       <w:tr>
+        <w:trPr>
+          <w:cantSplit w:val="1"/>
+          <w:tblHeader w:val="1"/>
+        </w:trPr>
         <w:tc>
           <w:tcPr>
             <w:tcW w:w="8830" w:type="dxa"/>
@@ -280,6 +287,9 @@
         </w:tc>
       </w:tr>
       <w:tr>
+        <w:trPr>
+          <w:cantSplit w:val="1"/>
+        </w:trPr>
         <w:tc>
           <w:tcPr>
             <w:tcW w:w="2943" w:type="dxa"/>
@@ -336,6 +346,9 @@
         </w:tc>
       </w:tr>
       <w:tr>
+        <w:trPr>
+          <w:cantSplit w:val="1"/>
+        </w:trPr>
         <w:tc>
           <w:tcPr>
             <w:tcW w:w="2943" w:type="dxa"/>
@@ -398,6 +411,9 @@
         </w:tc>
       </w:tr>
       <w:tr>
+        <w:trPr>
+          <w:cantSplit w:val="1"/>
+        </w:trPr>
         <w:tc>
           <w:tcPr>
             <w:tcW w:w="2943" w:type="dxa"/>
@@ -426,15 +442,12 @@
               <w:t>Local, Chrome 155 headless, proyecto Maven independiente (selenium-tests/), contra el frontend y backend ya levantados</w:t>
             </w:r>
           </w:p>
-          <w:p>
-            <w:pPr>
-              <w:spacing w:line="360" w:lineRule="auto"/>
-              <w:jc w:val="both"/>
-            </w:pPr>
-          </w:p>
         </w:tc>
       </w:tr>
       <w:tr>
+        <w:trPr>
+          <w:cantSplit w:val="1"/>
+        </w:trPr>
         <w:tc>
           <w:tcPr>
             <w:tcW w:w="2943" w:type="dxa"/>
@@ -463,21 +476,12 @@
               <w:t>Que un login valido redirija al menu, que un login invalido muestre error y no redirija, que la navegacion a Productos cargue el listado, y que cerrar sesion vuelva al login.</w:t>
             </w:r>
           </w:p>
-          <w:p>
-            <w:pPr>
-              <w:spacing w:line="360" w:lineRule="auto"/>
-              <w:jc w:val="both"/>
-            </w:pPr>
-          </w:p>
-          <w:p>
-            <w:pPr>
-              <w:spacing w:line="360" w:lineRule="auto"/>
-              <w:jc w:val="both"/>
-            </w:pPr>
-          </w:p>
         </w:tc>
       </w:tr>
       <w:tr>
+        <w:trPr>
+          <w:cantSplit w:val="1"/>
+        </w:trPr>
         <w:tc>
           <w:tcPr>
             <w:tcW w:w="2943" w:type="dxa"/>
@@ -506,21 +510,12 @@
               <w:t>4 de 4 pruebas pasaron (BUILD SUCCESS), controlando un navegador Chrome real: login con operador/operador123 redirige a /menu; login con clave incorrecta muestra el mensaje de error y permanece en /login; clic en Productos desde el menu carga la tabla de productos; cerrar sesion redirige de vuelta a /login.</w:t>
             </w:r>
           </w:p>
-          <w:p>
-            <w:pPr>
-              <w:spacing w:line="360" w:lineRule="auto"/>
-              <w:jc w:val="both"/>
-            </w:pPr>
-          </w:p>
-          <w:p>
-            <w:pPr>
-              <w:spacing w:line="360" w:lineRule="auto"/>
-              <w:jc w:val="both"/>
-            </w:pPr>
-          </w:p>
         </w:tc>
       </w:tr>
       <w:tr>
+        <w:trPr>
+          <w:cantSplit w:val="1"/>
+        </w:trPr>
         <w:tc>
           <w:tcPr>
             <w:tcW w:w="2943" w:type="dxa"/>
@@ -546,24 +541,15 @@
               <w:jc w:val="both"/>
             </w:pPr>
             <w:r>
-              <w:t>Se detecto y corrigio un error de diseno de la PRUEBA (no del sistema): el primer intento usaba un selector que encontraba el &lt;title&gt; de la pestana del navegador en vez del encabezado visible, por eso fallaba isDisplayed(). Se ajusto el selector para apuntar al &lt;header&gt; real; tras eso, 4/4 pasaron.</w:t>
-            </w:r>
-          </w:p>
-          <w:p>
-            <w:pPr>
-              <w:spacing w:line="360" w:lineRule="auto"/>
-              <w:jc w:val="both"/>
-            </w:pPr>
-          </w:p>
-          <w:p>
-            <w:pPr>
-              <w:spacing w:line="360" w:lineRule="auto"/>
-              <w:jc w:val="both"/>
-            </w:pPr>
+              <w:t>Al correr la prueba por primera vez, un caso fallaba: mi selector encontraba el &lt;title&gt; de la pestaña del navegador en vez del encabezado visible de la página, asi que isDisplayed() daba falso aunque la pagina estaba perfectamente bien. No era un error del sistema, sino de como escribi la prueba. Ajuste el selector para apuntar al &lt;header&gt; real y, despues de eso, los 4 casos pasaron.</w:t>
+            </w:r>
           </w:p>
         </w:tc>
       </w:tr>
       <w:tr>
+        <w:trPr>
+          <w:cantSplit w:val="1"/>
+        </w:trPr>
         <w:tc>
           <w:tcPr>
             <w:tcW w:w="2943" w:type="dxa"/>
@@ -574,7 +560,7 @@
               <w:jc w:val="both"/>
             </w:pPr>
             <w:r>
-              <w:t>Realizado Por: Estudiante 1</w:t>
+              <w:t>Realizado Por: Martín Villegas</w:t>
             </w:r>
           </w:p>
         </w:tc>
@@ -588,7 +574,7 @@
               <w:jc w:val="both"/>
             </w:pPr>
             <w:r>
-              <w:t>Autorizada Por: Estudiante 2 (par)</w:t>
+              <w:t>Autorizada Por: Belén Lisboa, Marco Tassara (equipo)</w:t>
             </w:r>
           </w:p>
         </w:tc>
@@ -606,11 +592,9 @@
                 <w:b/>
                 <w:bCs/>
               </w:rPr>
-              <w:t xml:space="preserve">Estatus: </w:t>
-            </w:r>
-            <w:r>
-              <w:t>Marque una Equis</w:t>
-            </w:r>
+              <w:t>Estatus: Marque una Equis</w:t>
+            </w:r>
+            <w:r/>
           </w:p>
           <w:p>
             <w:pPr>
@@ -627,16 +611,16 @@
               <w:jc w:val="both"/>
             </w:pPr>
             <w:r>
-              <w:t xml:space="preserve">[  X  ]  Rechazada </w:t>
-            </w:r>
-          </w:p>
-          <w:p>
-            <w:pPr>
-              <w:spacing w:line="360" w:lineRule="auto"/>
-              <w:jc w:val="both"/>
-            </w:pPr>
-            <w:r>
-              <w:t xml:space="preserve">[  X  ]   Diferida</w:t>
+              <w:t xml:space="preserve">[     ]  Rechazada </w:t>
+            </w:r>
+          </w:p>
+          <w:p>
+            <w:pPr>
+              <w:spacing w:line="360" w:lineRule="auto"/>
+              <w:jc w:val="both"/>
+            </w:pPr>
+            <w:r>
+              <w:t>[     ]   Diferida</w:t>
             </w:r>
           </w:p>
         </w:tc>
@@ -705,14 +689,13 @@
           <w:sz w:val="40"/>
           <w:szCs w:val="40"/>
         </w:rPr>
-        <w:t xml:space="preserve">Sistema: </w:t>
+        <w:t>Sistema: Gestor de Inventario</w:t>
       </w:r>
       <w:r>
         <w:rPr>
           <w:sz w:val="40"/>
           <w:szCs w:val="40"/>
         </w:rPr>
-        <w:t>Nombre del Sistema</w:t>
       </w:r>
     </w:p>
     <w:p>
@@ -727,14 +710,13 @@
           <w:sz w:val="32"/>
           <w:szCs w:val="32"/>
         </w:rPr>
-        <w:t>Realizado por</w:t>
+        <w:t>Realizado por: Marco Tassara</w:t>
       </w:r>
       <w:r>
         <w:rPr>
           <w:sz w:val="32"/>
           <w:szCs w:val="32"/>
         </w:rPr>
-        <w:t>: Estudiante 1</w:t>
       </w:r>
     </w:p>
     <w:tbl>
@@ -749,6 +731,10 @@
         <w:gridCol w:w="2944"/>
       </w:tblGrid>
       <w:tr>
+        <w:trPr>
+          <w:cantSplit w:val="1"/>
+          <w:tblHeader w:val="1"/>
+        </w:trPr>
         <w:tc>
           <w:tcPr>
             <w:tcW w:w="8830" w:type="dxa"/>
@@ -785,6 +771,9 @@
         </w:tc>
       </w:tr>
       <w:tr>
+        <w:trPr>
+          <w:cantSplit w:val="1"/>
+        </w:trPr>
         <w:tc>
           <w:tcPr>
             <w:tcW w:w="2943" w:type="dxa"/>
@@ -841,6 +830,9 @@
         </w:tc>
       </w:tr>
       <w:tr>
+        <w:trPr>
+          <w:cantSplit w:val="1"/>
+        </w:trPr>
         <w:tc>
           <w:tcPr>
             <w:tcW w:w="2943" w:type="dxa"/>
@@ -903,6 +895,9 @@
         </w:tc>
       </w:tr>
       <w:tr>
+        <w:trPr>
+          <w:cantSplit w:val="1"/>
+        </w:trPr>
         <w:tc>
           <w:tcPr>
             <w:tcW w:w="2943" w:type="dxa"/>
@@ -931,15 +926,12 @@
               <w:t>Local, SonarQube como contenedor Docker (localhost:9000), scanner ejecutado con JDK 21 (requisito del scanner, separado del JDK 17 de los servicios)</w:t>
             </w:r>
           </w:p>
-          <w:p>
-            <w:pPr>
-              <w:spacing w:line="360" w:lineRule="auto"/>
-              <w:jc w:val="both"/>
-            </w:pPr>
-          </w:p>
         </w:tc>
       </w:tr>
       <w:tr>
+        <w:trPr>
+          <w:cantSplit w:val="1"/>
+        </w:trPr>
         <w:tc>
           <w:tcPr>
             <w:tcW w:w="2943" w:type="dxa"/>
@@ -968,21 +960,12 @@
               <w:t>Que el analisis no muestre bugs ni duplicacion de codigo relevante, y que cualquier posible vulnerabilidad marcada se pueda justificar o corregir con criterio tecnico.</w:t>
             </w:r>
           </w:p>
-          <w:p>
-            <w:pPr>
-              <w:spacing w:line="360" w:lineRule="auto"/>
-              <w:jc w:val="both"/>
-            </w:pPr>
-          </w:p>
-          <w:p>
-            <w:pPr>
-              <w:spacing w:line="360" w:lineRule="auto"/>
-              <w:jc w:val="both"/>
-            </w:pPr>
-          </w:p>
         </w:tc>
       </w:tr>
       <w:tr>
+        <w:trPr>
+          <w:cantSplit w:val="1"/>
+        </w:trPr>
         <w:tc>
           <w:tcPr>
             <w:tcW w:w="2943" w:type="dxa"/>
@@ -1011,21 +994,12 @@
               <w:t>0 bugs, 0 code smells y 0% duplicacion en los 5 servicios. 6 vulnerabilidades (security hotspots) detectadas: 4 iguales (CSRF deshabilitado en SecurityConfig de inventory/product/category/report-service), 1 en auth-service (uso de HMAC-SHA1 en TotpService), y 1 en auth-service (password hardcodeada en DataSeeder, severidad BLOCKER). Rating de seguridad: D en 4 servicios, E (el mas bajo) en auth-service.</w:t>
             </w:r>
           </w:p>
-          <w:p>
-            <w:pPr>
-              <w:spacing w:line="360" w:lineRule="auto"/>
-              <w:jc w:val="both"/>
-            </w:pPr>
-          </w:p>
-          <w:p>
-            <w:pPr>
-              <w:spacing w:line="360" w:lineRule="auto"/>
-              <w:jc w:val="both"/>
-            </w:pPr>
-          </w:p>
         </w:tc>
       </w:tr>
       <w:tr>
+        <w:trPr>
+          <w:cantSplit w:val="1"/>
+        </w:trPr>
         <w:tc>
           <w:tcPr>
             <w:tcW w:w="2943" w:type="dxa"/>
@@ -1051,24 +1025,15 @@
               <w:jc w:val="both"/>
             </w:pPr>
             <w:r>
-              <w:t>De las 6 vulnerabilidades, 5 son falsos positivos justificables por contexto: deshabilitar CSRF es correcto en una API stateless con JWT (no hay cookies de sesion que atacar), y usar HMAC-SHA1 en TOTP es obligatorio por el estandar RFC 6238 (asi funcionan Google/Microsoft Authenticator). La sexta SI es un hallazgo real: las contrasenas semilla (admin123, operador123) estan escritas directo en DataSeeder.java. Recomendacion: moverlas a variables de entorno.</w:t>
-            </w:r>
-          </w:p>
-          <w:p>
-            <w:pPr>
-              <w:spacing w:line="360" w:lineRule="auto"/>
-              <w:jc w:val="both"/>
-            </w:pPr>
-          </w:p>
-          <w:p>
-            <w:pPr>
-              <w:spacing w:line="360" w:lineRule="auto"/>
-              <w:jc w:val="both"/>
-            </w:pPr>
+              <w:t>Revise una por una las 6 alertas de seguridad antes de sacar una conclusion. Cinco son falsos positivos que se explican por el contexto: deshabilitar CSRF tiene sentido en una API sin estado que usa JWT (no hay cookies de sesion que un atacante pueda aprovechar), y usar HMAC-SHA1 en el TOTP no es una debilidad aca, es lo que exige el propio estandar RFC 6238 para ser compatible con Google y Microsoft Authenticator. La sexta si es un hallazgo real: las contrasenas semilla (admin123, operador123) quedaron escritas directo en DataSeeder.java. Mi recomendacion es moverlas a variables de entorno antes de cualquier despliegue real.</w:t>
+            </w:r>
           </w:p>
         </w:tc>
       </w:tr>
       <w:tr>
+        <w:trPr>
+          <w:cantSplit w:val="1"/>
+        </w:trPr>
         <w:tc>
           <w:tcPr>
             <w:tcW w:w="2943" w:type="dxa"/>
@@ -1079,7 +1044,7 @@
               <w:jc w:val="both"/>
             </w:pPr>
             <w:r>
-              <w:t>Realizado Por: Estudiante 1</w:t>
+              <w:t>Realizado Por: Marco Tassara</w:t>
             </w:r>
           </w:p>
         </w:tc>
@@ -1093,7 +1058,7 @@
               <w:jc w:val="both"/>
             </w:pPr>
             <w:r>
-              <w:t>Autorizada Por: Estudiante 2 (par)</w:t>
+              <w:t>Autorizada Por: Belén Lisboa, Martín Villegas (equipo)</w:t>
             </w:r>
           </w:p>
         </w:tc>
@@ -1111,11 +1076,9 @@
                 <w:b/>
                 <w:bCs/>
               </w:rPr>
-              <w:t xml:space="preserve">Estatus: </w:t>
-            </w:r>
-            <w:r>
-              <w:t>Marque una Equis</w:t>
-            </w:r>
+              <w:t>Estatus: Marque una Equis</w:t>
+            </w:r>
+            <w:r/>
           </w:p>
           <w:p>
             <w:pPr>
@@ -1132,16 +1095,16 @@
               <w:jc w:val="both"/>
             </w:pPr>
             <w:r>
-              <w:t xml:space="preserve">[  X  ]  Rechazada </w:t>
-            </w:r>
-          </w:p>
-          <w:p>
-            <w:pPr>
-              <w:spacing w:line="360" w:lineRule="auto"/>
-              <w:jc w:val="both"/>
-            </w:pPr>
-            <w:r>
-              <w:t xml:space="preserve">[  X  ]   Diferida</w:t>
+              <w:t xml:space="preserve">[     ]  Rechazada </w:t>
+            </w:r>
+          </w:p>
+          <w:p>
+            <w:pPr>
+              <w:spacing w:line="360" w:lineRule="auto"/>
+              <w:jc w:val="both"/>
+            </w:pPr>
+            <w:r>
+              <w:t>[     ]   Diferida</w:t>
             </w:r>
           </w:p>
         </w:tc>
@@ -1210,14 +1173,13 @@
           <w:sz w:val="40"/>
           <w:szCs w:val="40"/>
         </w:rPr>
-        <w:t xml:space="preserve">Sistema: </w:t>
+        <w:t>Sistema: Gestor de Inventario</w:t>
       </w:r>
       <w:r>
         <w:rPr>
           <w:sz w:val="40"/>
           <w:szCs w:val="40"/>
         </w:rPr>
-        <w:t>Nombre del Sistema</w:t>
       </w:r>
     </w:p>
     <w:p>
@@ -1232,14 +1194,13 @@
           <w:sz w:val="32"/>
           <w:szCs w:val="32"/>
         </w:rPr>
-        <w:t>Realizado por</w:t>
+        <w:t>Realizado por: Belén Lisboa</w:t>
       </w:r>
       <w:r>
         <w:rPr>
           <w:sz w:val="32"/>
           <w:szCs w:val="32"/>
         </w:rPr>
-        <w:t xml:space="preserve">: Estudiante 2</w:t>
       </w:r>
     </w:p>
     <w:tbl>
@@ -1254,6 +1215,10 @@
         <w:gridCol w:w="2944"/>
       </w:tblGrid>
       <w:tr>
+        <w:trPr>
+          <w:cantSplit w:val="1"/>
+          <w:tblHeader w:val="1"/>
+        </w:trPr>
         <w:tc>
           <w:tcPr>
             <w:tcW w:w="8830" w:type="dxa"/>
@@ -1289,6 +1254,9 @@
         </w:tc>
       </w:tr>
       <w:tr>
+        <w:trPr>
+          <w:cantSplit w:val="1"/>
+        </w:trPr>
         <w:tc>
           <w:tcPr>
             <w:tcW w:w="2943" w:type="dxa"/>
@@ -1345,6 +1313,9 @@
         </w:tc>
       </w:tr>
       <w:tr>
+        <w:trPr>
+          <w:cantSplit w:val="1"/>
+        </w:trPr>
         <w:tc>
           <w:tcPr>
             <w:tcW w:w="2943" w:type="dxa"/>
@@ -1407,6 +1378,9 @@
         </w:tc>
       </w:tr>
       <w:tr>
+        <w:trPr>
+          <w:cantSplit w:val="1"/>
+        </w:trPr>
         <w:tc>
           <w:tcPr>
             <w:tcW w:w="2943" w:type="dxa"/>
@@ -1435,15 +1409,12 @@
               <w:t>Local, mvn test por servicio, Java 17, H2 en memoria (no la de archivo que usa la app en runtime)</w:t>
             </w:r>
           </w:p>
-          <w:p>
-            <w:pPr>
-              <w:spacing w:line="360" w:lineRule="auto"/>
-              <w:jc w:val="both"/>
-            </w:pPr>
-          </w:p>
         </w:tc>
       </w:tr>
       <w:tr>
+        <w:trPr>
+          <w:cantSplit w:val="1"/>
+        </w:trPr>
         <w:tc>
           <w:tcPr>
             <w:tcW w:w="2943" w:type="dxa"/>
@@ -1472,15 +1443,12 @@
               <w:t>Que cada servicio valide correctamente sus reglas de negocio (login/2FA, duplicados al crear Y editar, stock, movimientos) y que la capa de persistencia funcione contra una base de datos real.</w:t>
             </w:r>
           </w:p>
-          <w:p>
-            <w:pPr>
-              <w:spacing w:line="360" w:lineRule="auto"/>
-              <w:jc w:val="both"/>
-            </w:pPr>
-          </w:p>
         </w:tc>
       </w:tr>
       <w:tr>
+        <w:trPr>
+          <w:cantSplit w:val="1"/>
+        </w:trPr>
         <w:tc>
           <w:tcPr>
             <w:tcW w:w="2943" w:type="dxa"/>
@@ -1509,15 +1477,12 @@
               <w:t>40 pruebas en total sobre los 5 microservicios: 38 pasaron, 2 fallaron de forma intencional. auth-service 14/14, inventory-service 7/7, report-service 4/4 (BUILD SUCCESS). product-service 8/9 y category-service 5/6 (BUILD FAILURE): en ambos fallo el mismo caso, que expone un defecto real (actualizar() no valida codigo/nombre duplicado como si lo hace crear(), confirmado tambien contra H2 real via DataIntegrityViolationException).</w:t>
             </w:r>
           </w:p>
-          <w:p>
-            <w:pPr>
-              <w:spacing w:line="360" w:lineRule="auto"/>
-              <w:jc w:val="both"/>
-            </w:pPr>
-          </w:p>
         </w:tc>
       </w:tr>
       <w:tr>
+        <w:trPr>
+          <w:cantSplit w:val="1"/>
+        </w:trPr>
         <w:tc>
           <w:tcPr>
             <w:tcW w:w="2943" w:type="dxa"/>
@@ -1543,18 +1508,15 @@
               <w:jc w:val="both"/>
             </w:pPr>
             <w:r>
-              <w:t>Se detecto un defecto real de calidad replicado en 2 servicios: actualizar() permite dejar un codigo/nombre duplicado con otro registro porque no reutiliza la validacion que si tiene crear(). Recomendacion: agregar existsByXxxIgnoreCase tambien en actualizar(), excluyendo el propio id. El resto de la logica (2FA con codigo TOTP real via reflexion, bloqueo tras 5 intentos fallidos, calculo de valor de inventario, ajuste de stock) funciono correctamente.</w:t>
-            </w:r>
-          </w:p>
-          <w:p>
-            <w:pPr>
-              <w:spacing w:line="360" w:lineRule="auto"/>
-              <w:jc w:val="both"/>
-            </w:pPr>
+              <w:t>El hallazgo mas importante de esta prueba fue encontrar el mismo defecto repetido en dos servicios: actualizar() permite dejar un codigo o nombre duplicado con otro registro, porque no reutiliza la validacion que si tiene crear(). Mi recomendacion es agregar la misma validacion (existsByXxxIgnoreCase) tambien en actualizar(), excluyendo el propio id del registro que se esta editando. El resto de la logica que probe -2FA con un codigo TOTP real calculado por reflexion, el bloqueo despues de 5 intentos fallidos, el calculo del valor de inventario y el ajuste de stock- funciono correctamente.</w:t>
+            </w:r>
           </w:p>
         </w:tc>
       </w:tr>
       <w:tr>
+        <w:trPr>
+          <w:cantSplit w:val="1"/>
+        </w:trPr>
         <w:tc>
           <w:tcPr>
             <w:tcW w:w="2943" w:type="dxa"/>
@@ -1565,7 +1527,7 @@
               <w:jc w:val="both"/>
             </w:pPr>
             <w:r>
-              <w:t>Realizado Por: Estudiante 2</w:t>
+              <w:t>Realizado Por: Belén Lisboa</w:t>
             </w:r>
           </w:p>
         </w:tc>
@@ -1579,7 +1541,7 @@
               <w:jc w:val="both"/>
             </w:pPr>
             <w:r>
-              <w:t>Autorizada Por: Estudiante 1 (par)</w:t>
+              <w:t>Autorizada Por: Marco Tassara, Martín Villegas (equipo)</w:t>
             </w:r>
           </w:p>
         </w:tc>
@@ -1704,14 +1666,13 @@
           <w:sz w:val="40"/>
           <w:szCs w:val="40"/>
         </w:rPr>
-        <w:t xml:space="preserve">Sistema: </w:t>
+        <w:t>Sistema: Gestor de Inventario</w:t>
       </w:r>
       <w:r>
         <w:rPr>
           <w:sz w:val="40"/>
           <w:szCs w:val="40"/>
         </w:rPr>
-        <w:t>Nombre del Sistema</w:t>
       </w:r>
     </w:p>
     <w:p>
@@ -1726,14 +1687,13 @@
           <w:sz w:val="32"/>
           <w:szCs w:val="32"/>
         </w:rPr>
-        <w:t>Realizado por</w:t>
+        <w:t>Realizado por: Belén Lisboa</w:t>
       </w:r>
       <w:r>
         <w:rPr>
           <w:sz w:val="32"/>
           <w:szCs w:val="32"/>
         </w:rPr>
-        <w:t xml:space="preserve">: Estudiante 1</w:t>
       </w:r>
     </w:p>
     <w:tbl>
@@ -1748,6 +1708,10 @@
         <w:gridCol w:w="2944"/>
       </w:tblGrid>
       <w:tr>
+        <w:trPr>
+          <w:cantSplit w:val="1"/>
+          <w:tblHeader w:val="1"/>
+        </w:trPr>
         <w:tc>
           <w:tcPr>
             <w:tcW w:w="8830" w:type="dxa"/>
@@ -1783,6 +1747,9 @@
         </w:tc>
       </w:tr>
       <w:tr>
+        <w:trPr>
+          <w:cantSplit w:val="1"/>
+        </w:trPr>
         <w:tc>
           <w:tcPr>
             <w:tcW w:w="2943" w:type="dxa"/>
@@ -1839,6 +1806,9 @@
         </w:tc>
       </w:tr>
       <w:tr>
+        <w:trPr>
+          <w:cantSplit w:val="1"/>
+        </w:trPr>
         <w:tc>
           <w:tcPr>
             <w:tcW w:w="2943" w:type="dxa"/>
@@ -1895,6 +1865,9 @@
         </w:tc>
       </w:tr>
       <w:tr>
+        <w:trPr>
+          <w:cantSplit w:val="1"/>
+        </w:trPr>
         <w:tc>
           <w:tcPr>
             <w:tcW w:w="2943" w:type="dxa"/>
@@ -1923,15 +1896,12 @@
               <w:t>Local, Docker Desktop, ZAP ejecutado como contenedor contra los servicios ya levantados (host.docker.internal)</w:t>
             </w:r>
           </w:p>
-          <w:p>
-            <w:pPr>
-              <w:spacing w:line="360" w:lineRule="auto"/>
-              <w:jc w:val="both"/>
-            </w:pPr>
-          </w:p>
         </w:tc>
       </w:tr>
       <w:tr>
+        <w:trPr>
+          <w:cantSplit w:val="1"/>
+        </w:trPr>
         <w:tc>
           <w:tcPr>
             <w:tcW w:w="2943" w:type="dxa"/>
@@ -1960,15 +1930,12 @@
               <w:t>Que el escaneo no encuentre vulnerabilidades de riesgo Alto o Critico, y que se identifiquen oportunidades de mejora en cabeceras de seguridad HTTP.</w:t>
             </w:r>
           </w:p>
-          <w:p>
-            <w:pPr>
-              <w:spacing w:line="360" w:lineRule="auto"/>
-              <w:jc w:val="both"/>
-            </w:pPr>
-          </w:p>
         </w:tc>
       </w:tr>
       <w:tr>
+        <w:trPr>
+          <w:cantSplit w:val="1"/>
+        </w:trPr>
         <w:tc>
           <w:tcPr>
             <w:tcW w:w="2943" w:type="dxa"/>
@@ -1997,19 +1964,16 @@
               <w:t>Frontend: 56 reglas PASS, 11 WARN, 0 FAIL. auth-service: 66 PASS, 1 WARN, 0 FAIL. Ningun hallazgo de riesgo Alto o Critico en ninguno de los dos escaneos. Reportes completos guardados en docs/EvaluacionParcial2_TCY0101/owasp_zap/ (reporte_frontend.html, reporte_auth.html).</w:t>
             </w:r>
           </w:p>
-          <w:p>
-            <w:pPr>
-              <w:spacing w:line="360" w:lineRule="auto"/>
-              <w:jc w:val="both"/>
-            </w:pPr>
-          </w:p>
         </w:tc>
       </w:tr>
       <w:tr>
+        <w:trPr>
+          <w:cantSplit w:val="1"/>
+        </w:trPr>
         <w:tc>
           <w:tcPr>
             <w:tcW w:w="2943" w:type="dxa"/>
-            <w:shd w:val="clear" w:color="auto" w:fill="FFFF00"/>
+            <w:shd w:val="clear" w:color="auto" w:fill="auto"/>
           </w:tcPr>
           <w:p>
             <w:pPr>
@@ -2024,6 +1988,7 @@
               <w:t>Vulnerabilidades Detectadas</w:t>
             </w:r>
             <w:r>
+              <w:rPr/>
               <w:t>:</w:t>
             </w:r>
           </w:p>
@@ -2039,36 +2004,16 @@
               <w:jc w:val="both"/>
             </w:pPr>
             <w:r>
-              <w:t>13 tipos de hallazgo distintos en el frontend (2 riesgo Medio, 7 riesgo Bajo, 4 informativos): Content-Security-Policy no configurado (Medio, Confianza Alta), falta cabecera anti-clickjacking X-Frame-Options (Medio), faltan Cross-Origin-*-Policy (Bajo), falta X-Content-Type-Options (Bajo), header X-Powered-By expone el framework (Bajo), Permissions-Policy no configurada (Bajo), comentarios sospechosos en bundles JS (Informativo, 21 instancias), uso de funciones JS consideradas peligrosas como eval-like (Bajo, 2 instancias). En auth-service: 1 hallazgo menor (contenido no cacheable en rutas 401, esperado). Ninguna vulnerabilidad de inyeccion, XSS reflejado/almacenado ni exposicion de credenciales detectada.</w:t>
-            </w:r>
-          </w:p>
-          <w:p>
-            <w:pPr>
-              <w:spacing w:line="360" w:lineRule="auto"/>
-              <w:jc w:val="both"/>
-            </w:pPr>
-          </w:p>
-          <w:p>
-            <w:pPr>
-              <w:spacing w:line="360" w:lineRule="auto"/>
-              <w:jc w:val="both"/>
-            </w:pPr>
-          </w:p>
-          <w:p>
-            <w:pPr>
-              <w:spacing w:line="360" w:lineRule="auto"/>
-              <w:jc w:val="both"/>
-            </w:pPr>
-          </w:p>
-          <w:p>
-            <w:pPr>
-              <w:spacing w:line="360" w:lineRule="auto"/>
-              <w:jc w:val="both"/>
-            </w:pPr>
+              <w:rPr/>
+              <w:t>En el frontend encontre 13 tipos de hallazgo distintos (2 de riesgo Medio, 7 Bajo y 4 informativos), casi todos relacionados a cabeceras de seguridad HTTP que faltan: no hay Content-Security-Policy configurada (Medio, confianza Alta), falta la cabecera anti-clickjacking X-Frame-Options (Medio), faltan las Cross-Origin-*-Policy y X-Content-Type-Options (Bajo), el header X-Powered-By expone el framework usado (Bajo), y falta Permissions-Policy (Bajo). Tambien aparecen 21 comentarios sospechosos dentro de los bundles de JavaScript compilados (informativo) y 2 usos de funciones JS consideradas peligrosas tipo eval (Bajo). En auth-service solo salio 1 hallazgo menor, esperado por tratarse de rutas que responden 401. Lo mas importante: no encontre ninguna vulnerabilidad de inyeccion, XSS reflejado o almacenado, ni exposicion de credenciales.</w:t>
+            </w:r>
           </w:p>
         </w:tc>
       </w:tr>
       <w:tr>
+        <w:trPr>
+          <w:cantSplit w:val="1"/>
+        </w:trPr>
         <w:tc>
           <w:tcPr>
             <w:tcW w:w="2943" w:type="dxa"/>
@@ -2079,7 +2024,7 @@
               <w:jc w:val="both"/>
             </w:pPr>
             <w:r>
-              <w:t>Realizado Por: Estudiante 1</w:t>
+              <w:t>Realizado Por: Belén Lisboa</w:t>
             </w:r>
           </w:p>
         </w:tc>
@@ -2093,7 +2038,7 @@
               <w:jc w:val="both"/>
             </w:pPr>
             <w:r>
-              <w:t>Autorizada Por: Estudiante 2 (par)</w:t>
+              <w:t>Autorizada Por: Marco Tassara, Martín Villegas (equipo)</w:t>
             </w:r>
           </w:p>
         </w:tc>
@@ -2111,11 +2056,9 @@
                 <w:b/>
                 <w:bCs/>
               </w:rPr>
-              <w:t xml:space="preserve">Estatus: </w:t>
-            </w:r>
-            <w:r>
-              <w:t>Marque una Equis</w:t>
-            </w:r>
+              <w:t>Estatus: Marque una Equis</w:t>
+            </w:r>
+            <w:r/>
           </w:p>
           <w:p>
             <w:pPr>
@@ -2132,16 +2075,16 @@
               <w:jc w:val="both"/>
             </w:pPr>
             <w:r>
-              <w:t xml:space="preserve">[  X  ]  Rechazada </w:t>
-            </w:r>
-          </w:p>
-          <w:p>
-            <w:pPr>
-              <w:spacing w:line="360" w:lineRule="auto"/>
-              <w:jc w:val="both"/>
-            </w:pPr>
-            <w:r>
-              <w:t xml:space="preserve">[  X  ]   Diferida</w:t>
+              <w:t xml:space="preserve">[     ]  Rechazada </w:t>
+            </w:r>
+          </w:p>
+          <w:p>
+            <w:pPr>
+              <w:spacing w:line="360" w:lineRule="auto"/>
+              <w:jc w:val="both"/>
+            </w:pPr>
+            <w:r>
+              <w:t>[     ]   Diferida</w:t>
             </w:r>
           </w:p>
         </w:tc>
@@ -2219,14 +2162,13 @@
           <w:sz w:val="40"/>
           <w:szCs w:val="40"/>
         </w:rPr>
-        <w:t xml:space="preserve">Sistema: </w:t>
+        <w:t>Sistema: Gestor de Inventario</w:t>
       </w:r>
       <w:r>
         <w:rPr>
           <w:sz w:val="40"/>
           <w:szCs w:val="40"/>
         </w:rPr>
-        <w:t>Nombre del Sistema</w:t>
       </w:r>
     </w:p>
     <w:p>
@@ -2241,14 +2183,13 @@
           <w:sz w:val="32"/>
           <w:szCs w:val="32"/>
         </w:rPr>
-        <w:t>Realizado por</w:t>
+        <w:t>Realizado por: Martín Villegas</w:t>
       </w:r>
       <w:r>
         <w:rPr>
           <w:sz w:val="32"/>
           <w:szCs w:val="32"/>
         </w:rPr>
-        <w:t xml:space="preserve">: Estudiante 1</w:t>
       </w:r>
     </w:p>
     <w:tbl>
@@ -2263,6 +2204,10 @@
         <w:gridCol w:w="2944"/>
       </w:tblGrid>
       <w:tr>
+        <w:trPr>
+          <w:cantSplit w:val="1"/>
+          <w:tblHeader w:val="1"/>
+        </w:trPr>
         <w:tc>
           <w:tcPr>
             <w:tcW w:w="8830" w:type="dxa"/>
@@ -2298,6 +2243,9 @@
         </w:tc>
       </w:tr>
       <w:tr>
+        <w:trPr>
+          <w:cantSplit w:val="1"/>
+        </w:trPr>
         <w:tc>
           <w:tcPr>
             <w:tcW w:w="2943" w:type="dxa"/>
@@ -2354,6 +2302,9 @@
         </w:tc>
       </w:tr>
       <w:tr>
+        <w:trPr>
+          <w:cantSplit w:val="1"/>
+        </w:trPr>
         <w:tc>
           <w:tcPr>
             <w:tcW w:w="2943" w:type="dxa"/>
@@ -2410,6 +2361,9 @@
         </w:tc>
       </w:tr>
       <w:tr>
+        <w:trPr>
+          <w:cantSplit w:val="1"/>
+        </w:trPr>
         <w:tc>
           <w:tcPr>
             <w:tcW w:w="2943" w:type="dxa"/>
@@ -2438,15 +2392,12 @@
               <w:t>Local, Docker, rampa de 0 a 25 usuarios virtuales en 40 segundos (10s subida, 20s sostenido en 25 VUs, 10s bajada)</w:t>
             </w:r>
           </w:p>
-          <w:p>
-            <w:pPr>
-              <w:spacing w:line="360" w:lineRule="auto"/>
-              <w:jc w:val="both"/>
-            </w:pPr>
-          </w:p>
         </w:tc>
       </w:tr>
       <w:tr>
+        <w:trPr>
+          <w:cantSplit w:val="1"/>
+        </w:trPr>
         <w:tc>
           <w:tcPr>
             <w:tcW w:w="2943" w:type="dxa"/>
@@ -2475,15 +2426,12 @@
               <w:t>Que el 95% de las respuestas sea menor a 800ms y que la tasa de error sea menor al 1%, incluso en el pico de 25 usuarios concurrentes.</w:t>
             </w:r>
           </w:p>
-          <w:p>
-            <w:pPr>
-              <w:spacing w:line="360" w:lineRule="auto"/>
-              <w:jc w:val="both"/>
-            </w:pPr>
-          </w:p>
         </w:tc>
       </w:tr>
       <w:tr>
+        <w:trPr>
+          <w:cantSplit w:val="1"/>
+        </w:trPr>
         <w:tc>
           <w:tcPr>
             <w:tcW w:w="2943" w:type="dxa"/>
@@ -2512,21 +2460,12 @@
               <w:t>1.025 peticiones HTTP totales (25,5 req/s en promedio), 0% de errores (0 de 1025). Latencia: promedio 18,78ms, mediana 15,51ms, p90 24,33ms, p95 36,84ms, maximo 566,69ms. Los 2 umbrales definidos (p95&lt;800ms y tasa de error&lt;1%) se cumplieron con amplio margen. 2.048 checks ejecutados, 100% exitosos.</w:t>
             </w:r>
           </w:p>
-          <w:p>
-            <w:pPr>
-              <w:spacing w:line="360" w:lineRule="auto"/>
-              <w:jc w:val="both"/>
-            </w:pPr>
-          </w:p>
-          <w:p>
-            <w:pPr>
-              <w:spacing w:line="360" w:lineRule="auto"/>
-              <w:jc w:val="both"/>
-            </w:pPr>
-          </w:p>
         </w:tc>
       </w:tr>
       <w:tr>
+        <w:trPr>
+          <w:cantSplit w:val="1"/>
+        </w:trPr>
         <w:tc>
           <w:tcPr>
             <w:tcW w:w="2943" w:type="dxa"/>
@@ -2552,24 +2491,15 @@
               <w:jc w:val="both"/>
             </w:pPr>
             <w:r>
-              <w:t>El sistema responde muy por debajo del umbral exigido incluso en el pico de 25 usuarios concurrentes (p95 de 36,84ms vs 800ms permitido) - no se encontraron cuellos de botella con esta carga. Para una prueba de estres mas exigente se recomendaria subir el pico a 100+ VUs y usar tasas de llegada constantes en vez de VUs.</w:t>
-            </w:r>
-          </w:p>
-          <w:p>
-            <w:pPr>
-              <w:spacing w:line="360" w:lineRule="auto"/>
-              <w:jc w:val="both"/>
-            </w:pPr>
-          </w:p>
-          <w:p>
-            <w:pPr>
-              <w:spacing w:line="360" w:lineRule="auto"/>
-              <w:jc w:val="both"/>
-            </w:pPr>
+              <w:t>El sistema respondio muy por debajo del umbral exigido, incluso en el pico de 25 usuarios concurrentes (p95 de 36,84 ms contra los 800 ms permitidos) - con esta carga no encontre ningun cuello de botella. Eso si, 25 usuarios es una carga bastante modesta para un sistema real; para una prueba de estres mas exigente recomendaria subir el pico a 100 o mas usuarios y usar tasas de llegada constantes en vez de usuarios virtuales.</w:t>
+            </w:r>
           </w:p>
         </w:tc>
       </w:tr>
       <w:tr>
+        <w:trPr>
+          <w:cantSplit w:val="1"/>
+        </w:trPr>
         <w:tc>
           <w:tcPr>
             <w:tcW w:w="2943" w:type="dxa"/>
@@ -2580,7 +2510,7 @@
               <w:jc w:val="both"/>
             </w:pPr>
             <w:r>
-              <w:t>Realizado Por: Estudiante 1</w:t>
+              <w:t>Realizado Por: Martín Villegas</w:t>
             </w:r>
           </w:p>
         </w:tc>
@@ -2594,7 +2524,7 @@
               <w:jc w:val="both"/>
             </w:pPr>
             <w:r>
-              <w:t>Autorizada Por: Estudiante 2 (par)</w:t>
+              <w:t>Autorizada Por: Belén Lisboa, Marco Tassara (equipo)</w:t>
             </w:r>
           </w:p>
         </w:tc>
@@ -2612,11 +2542,9 @@
                 <w:b/>
                 <w:bCs/>
               </w:rPr>
-              <w:t xml:space="preserve">Estatus: </w:t>
-            </w:r>
-            <w:r>
-              <w:t>Marque una Equis</w:t>
-            </w:r>
+              <w:t>Estatus: Marque una Equis</w:t>
+            </w:r>
+            <w:r/>
           </w:p>
           <w:p>
             <w:pPr>
@@ -2633,16 +2561,16 @@
               <w:jc w:val="both"/>
             </w:pPr>
             <w:r>
-              <w:t xml:space="preserve">[  X  ]  Rechazada </w:t>
-            </w:r>
-          </w:p>
-          <w:p>
-            <w:pPr>
-              <w:spacing w:line="360" w:lineRule="auto"/>
-              <w:jc w:val="both"/>
-            </w:pPr>
-            <w:r>
-              <w:t xml:space="preserve">[  X  ]   Diferida</w:t>
+              <w:t xml:space="preserve">[     ]  Rechazada </w:t>
+            </w:r>
+          </w:p>
+          <w:p>
+            <w:pPr>
+              <w:spacing w:line="360" w:lineRule="auto"/>
+              <w:jc w:val="both"/>
+            </w:pPr>
+            <w:r>
+              <w:t>[     ]   Diferida</w:t>
             </w:r>
           </w:p>
         </w:tc>
@@ -2714,14 +2642,13 @@
           <w:sz w:val="40"/>
           <w:szCs w:val="40"/>
         </w:rPr>
-        <w:t xml:space="preserve">Sistema: </w:t>
+        <w:t>Sistema: Gestor de Inventario</w:t>
       </w:r>
       <w:r>
         <w:rPr>
           <w:sz w:val="40"/>
           <w:szCs w:val="40"/>
         </w:rPr>
-        <w:t>Nombre del Sistema</w:t>
       </w:r>
     </w:p>
     <w:p>
@@ -2736,14 +2663,13 @@
           <w:sz w:val="32"/>
           <w:szCs w:val="32"/>
         </w:rPr>
-        <w:t>Realizado por</w:t>
+        <w:t>Realizado por: Belén Lisboa, Marco Tassara y Martín Villegas</w:t>
       </w:r>
       <w:r>
         <w:rPr>
           <w:sz w:val="32"/>
           <w:szCs w:val="32"/>
         </w:rPr>
-        <w:t xml:space="preserve">: Estudiante 1 y Estudiante 2</w:t>
       </w:r>
     </w:p>
     <w:p>
@@ -2752,272 +2678,573 @@
         <w:jc w:val="right"/>
       </w:pPr>
     </w:p>
-    <w:tbl>
-      <w:tblPr>
-        <w:tblStyle w:val="Tablaconcuadrcula"/>
-        <w:tblW w:w="0" w:type="auto"/>
-        <w:tblLook w:val="04A0" w:firstRow="1" w:lastRow="0" w:firstColumn="1" w:lastColumn="0" w:noHBand="0" w:noVBand="1"/>
-      </w:tblPr>
-      <w:tblGrid>
-        <w:gridCol w:w="4415"/>
-        <w:gridCol w:w="4415"/>
-      </w:tblGrid>
-      <w:tr>
-        <w:tc>
-          <w:tcPr>
-            <w:tcW w:w="8830" w:type="dxa"/>
-            <w:gridSpan w:val="2"/>
-            <w:shd w:val="clear" w:color="auto" w:fill="BDD6EE" w:themeFill="accent5" w:themeFillTint="66"/>
-          </w:tcPr>
-          <w:p>
-            <w:pPr>
-              <w:spacing w:line="360" w:lineRule="auto"/>
-              <w:jc w:val="center"/>
-              <w:rPr>
-                <w:b/>
-                <w:bCs/>
-                <w:sz w:val="40"/>
-                <w:szCs w:val="40"/>
-              </w:rPr>
-            </w:pPr>
-            <w:r>
-              <w:rPr>
-                <w:b/>
-                <w:bCs/>
-                <w:sz w:val="40"/>
-                <w:szCs w:val="40"/>
-              </w:rPr>
-              <w:t>CONCLUSIONES PRELIMINARES</w:t>
-            </w:r>
-          </w:p>
-        </w:tc>
-      </w:tr>
-      <w:tr>
-        <w:tc>
-          <w:tcPr>
-            <w:tcW w:w="4415" w:type="dxa"/>
-          </w:tcPr>
-          <w:p>
-            <w:pPr>
-              <w:spacing w:line="360" w:lineRule="auto"/>
-              <w:jc w:val="both"/>
-              <w:rPr>
-                <w:b/>
-                <w:bCs/>
-              </w:rPr>
-            </w:pPr>
-            <w:r>
-              <w:rPr>
-                <w:b/>
-                <w:bCs/>
-              </w:rPr>
-              <w:t>INDIVIDUAL - Estudiante 1: Corri Selenium (4/4), OWASP ZAP (0 hallazgos criticos en 2 escaneos), SonarQube (0 bugs/code smells en 5 servicios, 6 security hotspots revisados con criterio) y k6 (p95=36,84ms, 0% error con 25 usuarios concurrentes). El aprendizaje principal: una herramienta de analisis automatico no reemplaza el criterio humano - de 6 alertas de seguridad de SonarQube, 5 eran falsos positivos justificables por el contexto (API stateless con JWT, estandar RFC 6238 para TOTP) y solo 1 era un hallazgo real (password hardcodeada). Saber distinguir eso es, creo, la parte mas importante del rol de QA, mas alla de simplemente correr la herramienta.</w:t>
-            </w:r>
-          </w:p>
-          <w:p>
-            <w:pPr>
-              <w:spacing w:line="360" w:lineRule="auto"/>
-              <w:jc w:val="both"/>
-              <w:rPr>
-                <w:b/>
-                <w:bCs/>
-              </w:rPr>
-            </w:pPr>
-          </w:p>
-          <w:p>
-            <w:pPr>
-              <w:spacing w:line="360" w:lineRule="auto"/>
-              <w:jc w:val="both"/>
-              <w:rPr>
-                <w:b/>
-                <w:bCs/>
-              </w:rPr>
-            </w:pPr>
-          </w:p>
-          <w:p>
-            <w:pPr>
-              <w:spacing w:line="360" w:lineRule="auto"/>
-              <w:jc w:val="both"/>
-              <w:rPr>
-                <w:b/>
-                <w:bCs/>
-              </w:rPr>
-            </w:pPr>
-          </w:p>
-          <w:p>
-            <w:pPr>
-              <w:spacing w:line="360" w:lineRule="auto"/>
-              <w:jc w:val="both"/>
-              <w:rPr>
-                <w:b/>
-                <w:bCs/>
-              </w:rPr>
-            </w:pPr>
-          </w:p>
-          <w:p>
-            <w:pPr>
-              <w:spacing w:line="360" w:lineRule="auto"/>
-              <w:jc w:val="both"/>
-              <w:rPr>
-                <w:b/>
-                <w:bCs/>
-              </w:rPr>
-            </w:pPr>
-          </w:p>
-          <w:p>
-            <w:pPr>
-              <w:spacing w:line="360" w:lineRule="auto"/>
-              <w:jc w:val="both"/>
-              <w:rPr>
-                <w:b/>
-                <w:bCs/>
-              </w:rPr>
-            </w:pPr>
-          </w:p>
-          <w:p>
-            <w:pPr>
-              <w:spacing w:line="360" w:lineRule="auto"/>
-              <w:jc w:val="both"/>
-              <w:rPr>
-                <w:b/>
-                <w:bCs/>
-              </w:rPr>
-            </w:pPr>
-          </w:p>
-        </w:tc>
-        <w:tc>
-          <w:tcPr>
-            <w:tcW w:w="4415" w:type="dxa"/>
-          </w:tcPr>
-          <w:p>
-            <w:pPr>
-              <w:spacing w:line="360" w:lineRule="auto"/>
-              <w:jc w:val="both"/>
-              <w:rPr>
-                <w:b/>
-                <w:bCs/>
-              </w:rPr>
-            </w:pPr>
-            <w:r>
-              <w:rPr>
-                <w:b/>
-                <w:bCs/>
-              </w:rPr>
-              <w:t>INDIVIDUAL - Estudiante 2: Escribi y corri 40 pruebas JUnit en los 5 microservicios (38 pasaron, 2 fallaron de forma intencional). Nunca existia un test en el repo antes de esta evaluacion. Lo mas valioso no fueron los 38 que pasaron, sino los 2 que fallaron a proposito: encontre que actualizar() en product-service y category-service no valida duplicados como si lo hace crear(), un defecto real replicado en dos servicios por copiar el mismo patron de codigo. Confirme el hallazgo en dos capas (unitaria con mocks e integracion con base de datos real), lo que me dio mas confianza de que no era un error de configuracion del test sino del sistema.</w:t>
-            </w:r>
-          </w:p>
-          <w:p>
-            <w:pPr>
-              <w:spacing w:line="360" w:lineRule="auto"/>
-              <w:jc w:val="both"/>
-            </w:pPr>
-          </w:p>
-          <w:p>
-            <w:pPr>
-              <w:spacing w:line="360" w:lineRule="auto"/>
-              <w:jc w:val="both"/>
-            </w:pPr>
-          </w:p>
-          <w:p>
-            <w:pPr>
-              <w:spacing w:line="360" w:lineRule="auto"/>
-              <w:jc w:val="both"/>
-            </w:pPr>
-          </w:p>
-        </w:tc>
-      </w:tr>
-      <w:tr>
-        <w:trPr>
-          <w:trHeight w:val="600"/>
-        </w:trPr>
-        <w:tc>
-          <w:tcPr>
-            <w:tcW w:w="8830" w:type="dxa"/>
-            <w:gridSpan w:val="2"/>
-          </w:tcPr>
-          <w:p>
-            <w:pPr>
-              <w:spacing w:line="360" w:lineRule="auto"/>
-              <w:jc w:val="both"/>
-            </w:pPr>
-            <w:r>
-              <w:t>CONCLUSIONES GENERALES OBTENIDAS: Se aplicaron las 5 herramientas que pide la pauta (JUnit, OWASP ZAP, SonarQube, Selenium, k6) contra el sistema real de Gestion de Inventario, con evidencia reproducible (no simulada) en cada caso: 40 pruebas JUnit, 2 escaneos ZAP, analisis SonarQube de 3.110 lineas en 5 servicios, 4 pruebas Selenium con navegador real, y una prueba de carga de 1.025 peticiones con k6. En conjunto, el sistema resulto solido en la mayoria de los frentes (0% errores bajo carga, sin vulnerabilidades criticas, sin bugs ni duplicacion de codigo), pero el proceso de testing SI encontro defectos reales y accionables: un bug funcional replicado en 2 servicios (validacion de duplicados faltante al editar) y un hallazgo de seguridad real (credenciales hardcodeadas). Eso demuestra el valor concreto de aplicar estas herramientas: no para confirmar que todo esta bien, sino para encontrar lo que no lo esta.</w:t>
-            </w:r>
-          </w:p>
-          <w:p>
-            <w:pPr>
-              <w:spacing w:line="360" w:lineRule="auto"/>
-              <w:jc w:val="both"/>
-              <w:rPr>
-                <w:b/>
-                <w:bCs/>
-              </w:rPr>
-            </w:pPr>
-            <w:r>
-              <w:rPr>
-                <w:b/>
-                <w:bCs/>
-              </w:rPr>
-              <w:t xml:space="preserve">CONCLUSIONES GENERALES OBTENIDAS:</w:t>
-            </w:r>
-          </w:p>
-          <w:p>
-            <w:pPr>
-              <w:spacing w:line="360" w:lineRule="auto"/>
-              <w:jc w:val="both"/>
-            </w:pPr>
-          </w:p>
-          <w:p>
-            <w:pPr>
-              <w:spacing w:line="360" w:lineRule="auto"/>
-              <w:jc w:val="both"/>
-            </w:pPr>
-          </w:p>
-          <w:p>
-            <w:pPr>
-              <w:spacing w:line="360" w:lineRule="auto"/>
-              <w:jc w:val="both"/>
-            </w:pPr>
-          </w:p>
-          <w:p>
-            <w:pPr>
-              <w:spacing w:line="360" w:lineRule="auto"/>
-              <w:jc w:val="both"/>
-            </w:pPr>
-          </w:p>
-          <w:p>
-            <w:pPr>
-              <w:spacing w:line="360" w:lineRule="auto"/>
-              <w:jc w:val="both"/>
-            </w:pPr>
-          </w:p>
-          <w:p>
-            <w:pPr>
-              <w:spacing w:line="360" w:lineRule="auto"/>
-              <w:jc w:val="both"/>
-            </w:pPr>
-          </w:p>
-          <w:p>
-            <w:pPr>
-              <w:spacing w:line="360" w:lineRule="auto"/>
-              <w:jc w:val="both"/>
-            </w:pPr>
-          </w:p>
-          <w:p>
-            <w:pPr>
-              <w:spacing w:line="360" w:lineRule="auto"/>
-              <w:jc w:val="both"/>
-            </w:pPr>
-          </w:p>
-        </w:tc>
-      </w:tr>
-    </w:tbl>
+    <w:p>
+      <w:pPr>
+        <w:spacing w:after="200" w:line="276" w:lineRule="auto"/>
+      </w:pPr>
+      <w:r>
+        <w:rPr>
+          <w:b/>
+          <w:bCs/>
+          <w:sz w:val="22"/>
+          <w:szCs w:val="22"/>
+        </w:rPr>
+        <w:t xml:space="preserve">INDIVIDUAL - Martin Villegas:</w:t>
+      </w:r>
+      <w:r>
+        <w:rPr>
+          <w:sz w:val="22"/>
+          <w:szCs w:val="22"/>
+        </w:rPr>
+        <w:t xml:space="preserve"> Corri las pruebas automatizadas con Selenium WebDriver 4.23 (Java) sobre Chrome headless: 4 de 4 pasaron (un login valido redirige a /menu, uno invalido muestra el error y no redirige, la navegacion a Productos carga el listado, y cerrar sesion vuelve a /login). Tambien ejecute la prueba de carga con k6: 1.025 peticiones con hasta 25 usuarios virtuales, 0% de errores y p95 de 36,84 ms frente al umbral de 800 ms. El aprendizaje principal fue que un test puede fallar por un error de diseno propio: mi primer intento usaba un selector que encontraba el &lt;title&gt; de la pestana en vez del encabezado visible, asi que el fallo no era del sistema. Aprendi a revisar un fallo antes de culpar a la aplicacion. Ademas, la prueba de carga mostro que el sistema responde muy por debajo del umbral, pero 25 usuarios es una carga modesta: para un estres real recomendaria subir a 100 o mas usuarios.</w:t>
+      </w:r>
+    </w:p>
+    <w:p>
+      <w:pPr>
+        <w:spacing w:after="200" w:line="276" w:lineRule="auto"/>
+      </w:pPr>
+      <w:r>
+        <w:rPr>
+          <w:b/>
+          <w:bCs/>
+          <w:sz w:val="22"/>
+          <w:szCs w:val="22"/>
+        </w:rPr>
+        <w:t xml:space="preserve">INDIVIDUAL - Marco Tassara:</w:t>
+      </w:r>
+      <w:r>
+        <w:rPr>
+          <w:sz w:val="22"/>
+          <w:szCs w:val="22"/>
+        </w:rPr>
+        <w:t xml:space="preserve"> Ejecute el analisis estatico con SonarQube Community Edition (Docker) y sonar-maven-plugin sobre los 5 microservicios (auth, category, product, inventory y report), con 3.110 lineas de codigo analizadas. El resultado fue 0 bugs, 0 code smells y 0% de duplicacion, pero 6 security hotspots: 4 por CSRF deshabilitado (inventory, product, category y report), 1 por uso de HMAC-SHA1 en TotpService (auth-service) y 1 por contrasenas semilla escritas directamente en DataSeeder.java (severidad BLOCKER). El rating de seguridad salio D en 4 servicios y E en auth-service, asi que no lo considere un resultado limpio sin revisarlo. Lo que aprendi es que una herramienta automatica no reemplaza el criterio: 5 de las 6 alertas son justificables por contexto (una API stateless con JWT no tiene cookies de sesion que atacar, y HMAC-SHA1 es obligatorio en TOTP segun la RFC 6238), y solo la contrasena hardcodeada es un hallazgo real, que recomiendo mover a variables de entorno. Saber distinguir eso es, creo, la parte mas importante del rol de QA.</w:t>
+      </w:r>
+    </w:p>
+    <w:p>
+      <w:pPr>
+        <w:spacing w:after="200" w:line="276" w:lineRule="auto"/>
+      </w:pPr>
+      <w:r>
+        <w:rPr>
+          <w:b/>
+          <w:bCs/>
+          <w:sz w:val="22"/>
+          <w:szCs w:val="22"/>
+        </w:rPr>
+        <w:t xml:space="preserve">INDIVIDUAL - Belen Lisboa:</w:t>
+      </w:r>
+      <w:r>
+        <w:rPr>
+          <w:sz w:val="22"/>
+          <w:szCs w:val="22"/>
+        </w:rPr>
+        <w:t xml:space="preserve"> Escribi y ejecute 40 pruebas JUnit 5 (con Mockito, AssertJ y @DataJpaTest sobre H2) en los 5 microservicios: 38 pasaron y 2 fallaron de forma intencional, porque el caso fallido expone un defecto real: actualizar() en product-service y category-service no valida codigo/nombre duplicado como si lo hace crear(). Confirme el hallazgo en dos capas (unitaria con mocks e integracion contra H2, donde aparece DataIntegrityViolationException), lo que me dio mas confianza de que el problema era del sistema y no de la configuracion del test. Tambien ejecute OWASP ZAP (zap-baseline) sobre el frontend y el auth-service: ningun hallazgo de riesgo Alto o Critico, con 11 advertencias (WARN) en el frontend -principalmente cabeceras de seguridad como Content-Security-Policy y X-Frame-Options- y 1 en auth-service. Aprendi que los tests que pasan no demuestran mucho por si solos; lo valioso fueron los dos casos que fallaron a proposito. Y que un escaneo automatico detecta cabeceras faltantes, pero no reemplaza probar a mano los flujos de autenticacion.</w:t>
+      </w:r>
+    </w:p>
+    <w:p>
+      <w:pPr>
+        <w:spacing w:after="200" w:line="276" w:lineRule="auto"/>
+      </w:pPr>
+      <w:r>
+        <w:rPr>
+          <w:sz w:val="22"/>
+          <w:szCs w:val="22"/>
+        </w:rPr>
+        <w:t xml:space="preserve"/>
+      </w:r>
+    </w:p>
+    <w:p>
+      <w:pPr>
+        <w:spacing w:after="200" w:line="276" w:lineRule="auto"/>
+      </w:pPr>
+      <w:r>
+        <w:rPr>
+          <w:b/>
+          <w:bCs/>
+          <w:sz w:val="22"/>
+          <w:szCs w:val="22"/>
+        </w:rPr>
+        <w:t xml:space="preserve">En conclusion,</w:t>
+      </w:r>
+      <w:r>
+        <w:rPr>
+          <w:sz w:val="22"/>
+          <w:szCs w:val="22"/>
+        </w:rPr>
+        <w:t xml:space="preserve"> se aplicaron las 5 herramientas que pide la pauta (JUnit, OWASP ZAP, SonarQube, Selenium y k6), con evidencia reproducible en cada caso: 40 pruebas JUnit, 2 escaneos ZAP, analisis SonarQube de 3.110 lineas en 5 servicios, 4 pruebas Selenium con navegador real y una prueba de carga de 1.025 peticiones con k6. En conjunto, el sistema resulto solido en rendimiento (0% de errores y p95 de 36,84 ms con 25 usuarios concurrentes) y sin hallazgos de riesgo Alto o Critico en ZAP, pero no esta libre de observaciones: el rating de seguridad de SonarQube fue D y E, faltan cabeceras HTTP de seguridad, y el proceso si encontro defectos reales y accionables: una validacion de duplicados faltante al actualizar (replicada en 2 servicios) y credenciales semilla hardcodeadas. Eso demuestra el valor de aplicar estas herramientas: no para confirmar que todo esta bien, sino para encontrar lo que no lo esta.</w:t>
+      </w:r>
+    </w:p>
     <w:p>
       <w:pPr>
         <w:spacing w:line="360" w:lineRule="auto"/>
         <w:jc w:val="both"/>
       </w:pPr>
     </w:p>
+    <w:p>
+      <w:pPr>
+        <w:jc w:val="right"/>
+      </w:pPr>
+      <w:r>
+        <w:rPr>
+          <w:b/>
+          <w:sz w:val="40"/>
+        </w:rPr>
+        <w:t>Anexos: Evidencia Fotografica de los Procedimientos</w:t>
+      </w:r>
+    </w:p>
+    <w:p>
+      <w:pPr>
+        <w:jc w:val="right"/>
+      </w:pPr>
+      <w:r>
+        <w:rPr>
+          <w:sz w:val="24"/>
+        </w:rPr>
+        <w:t>Capturas reales de la ejecucion de cada herramienta, tomadas directamente de las pantallas y consolas usadas durante las pruebas (no son obligatorias segun la pauta, se incluyen como respaldo visual adicional).</w:t>
+      </w:r>
+    </w:p>
+    <w:p/>
+    <w:p>
+      <w:r>
+        <w:rPr>
+          <w:b/>
+          <w:sz w:val="24"/>
+        </w:rPr>
+        <w:t>Anexo 1 - OWASP ZAP: reporte de escaneo de vulnerabilidades del frontend (http://localhost:3000).</w:t>
+      </w:r>
+    </w:p>
+    <w:p>
+      <w:pPr>
+        <w:jc w:val="center"/>
+      </w:pPr>
+      <w:r>
+        <w:drawing>
+          <wp:inline xmlns:a="http://schemas.openxmlformats.org/drawingml/2006/main" xmlns:pic="http://schemas.openxmlformats.org/drawingml/2006/picture">
+            <wp:extent cx="5577840" cy="7171509"/>
+            <wp:docPr id="1" name="Picture 1"/>
+            <wp:cNvGraphicFramePr>
+              <a:graphicFrameLocks noChangeAspect="1"/>
+            </wp:cNvGraphicFramePr>
+            <a:graphic>
+              <a:graphicData uri="http://schemas.openxmlformats.org/drawingml/2006/picture">
+                <pic:pic>
+                  <pic:nvPicPr>
+                    <pic:cNvPr id="0" name="01_zap_frontend.png"/>
+                    <pic:cNvPicPr/>
+                  </pic:nvPicPr>
+                  <pic:blipFill>
+                    <a:blip r:embed="rId10"/>
+                    <a:stretch>
+                      <a:fillRect/>
+                    </a:stretch>
+                  </pic:blipFill>
+                  <pic:spPr>
+                    <a:xfrm>
+                      <a:off x="0" y="0"/>
+                      <a:ext cx="5577840" cy="7171509"/>
+                    </a:xfrm>
+                    <a:prstGeom prst="rect"/>
+                  </pic:spPr>
+                </pic:pic>
+              </a:graphicData>
+            </a:graphic>
+          </wp:inline>
+        </w:drawing>
+      </w:r>
+    </w:p>
+    <w:p/>
+    <w:p>
+      <w:r>
+        <w:rPr>
+          <w:b/>
+          <w:sz w:val="24"/>
+        </w:rPr>
+        <w:t>Anexo 2 - OWASP ZAP: reporte de escaneo de vulnerabilidades de auth-service.</w:t>
+      </w:r>
+    </w:p>
+    <w:p>
+      <w:pPr>
+        <w:jc w:val="center"/>
+      </w:pPr>
+      <w:r>
+        <w:drawing>
+          <wp:inline xmlns:a="http://schemas.openxmlformats.org/drawingml/2006/main" xmlns:pic="http://schemas.openxmlformats.org/drawingml/2006/picture">
+            <wp:extent cx="5577840" cy="7171509"/>
+            <wp:docPr id="2" name="Picture 2"/>
+            <wp:cNvGraphicFramePr>
+              <a:graphicFrameLocks noChangeAspect="1"/>
+            </wp:cNvGraphicFramePr>
+            <a:graphic>
+              <a:graphicData uri="http://schemas.openxmlformats.org/drawingml/2006/picture">
+                <pic:pic>
+                  <pic:nvPicPr>
+                    <pic:cNvPr id="0" name="02_zap_auth.png"/>
+                    <pic:cNvPicPr/>
+                  </pic:nvPicPr>
+                  <pic:blipFill>
+                    <a:blip r:embed="rId11"/>
+                    <a:stretch>
+                      <a:fillRect/>
+                    </a:stretch>
+                  </pic:blipFill>
+                  <pic:spPr>
+                    <a:xfrm>
+                      <a:off x="0" y="0"/>
+                      <a:ext cx="5577840" cy="7171509"/>
+                    </a:xfrm>
+                    <a:prstGeom prst="rect"/>
+                  </pic:spPr>
+                </pic:pic>
+              </a:graphicData>
+            </a:graphic>
+          </wp:inline>
+        </w:drawing>
+      </w:r>
+    </w:p>
+    <w:p/>
+    <w:p>
+      <w:r>
+        <w:rPr>
+          <w:b/>
+          <w:sz w:val="24"/>
+        </w:rPr>
+        <w:t>Anexo 3 - Pantalla real de login del frontend (http://localhost:3000/login), la misma que recorren las pruebas Selenium.</w:t>
+      </w:r>
+    </w:p>
+    <w:p>
+      <w:pPr>
+        <w:jc w:val="center"/>
+      </w:pPr>
+      <w:r>
+        <w:drawing>
+          <wp:inline xmlns:a="http://schemas.openxmlformats.org/drawingml/2006/main" xmlns:pic="http://schemas.openxmlformats.org/drawingml/2006/picture">
+            <wp:extent cx="5577840" cy="3675004"/>
+            <wp:docPr id="3" name="Picture 3"/>
+            <wp:cNvGraphicFramePr>
+              <a:graphicFrameLocks noChangeAspect="1"/>
+            </wp:cNvGraphicFramePr>
+            <a:graphic>
+              <a:graphicData uri="http://schemas.openxmlformats.org/drawingml/2006/picture">
+                <pic:pic>
+                  <pic:nvPicPr>
+                    <pic:cNvPr id="0" name="03_frontend_login.png"/>
+                    <pic:cNvPicPr/>
+                  </pic:nvPicPr>
+                  <pic:blipFill>
+                    <a:blip r:embed="rId12"/>
+                    <a:stretch>
+                      <a:fillRect/>
+                    </a:stretch>
+                  </pic:blipFill>
+                  <pic:spPr>
+                    <a:xfrm>
+                      <a:off x="0" y="0"/>
+                      <a:ext cx="5577840" cy="3675004"/>
+                    </a:xfrm>
+                    <a:prstGeom prst="rect"/>
+                  </pic:spPr>
+                </pic:pic>
+              </a:graphicData>
+            </a:graphic>
+          </wp:inline>
+        </w:drawing>
+      </w:r>
+    </w:p>
+    <w:p/>
+    <w:p>
+      <w:r>
+        <w:rPr>
+          <w:b/>
+          <w:sz w:val="24"/>
+        </w:rPr>
+        <w:t>Anexo 4 - Ejecucion real de JUnit en product-service: se observa la falla intencional que expone que actualizar() no valida codigo duplicado con otro producto (bug real documentado en la seccion de Pruebas Unitarias).</w:t>
+      </w:r>
+    </w:p>
+    <w:p>
+      <w:pPr>
+        <w:jc w:val="center"/>
+      </w:pPr>
+      <w:r>
+        <w:drawing>
+          <wp:inline xmlns:a="http://schemas.openxmlformats.org/drawingml/2006/main" xmlns:pic="http://schemas.openxmlformats.org/drawingml/2006/picture">
+            <wp:extent cx="5577840" cy="4183380"/>
+            <wp:docPr id="4" name="Picture 4"/>
+            <wp:cNvGraphicFramePr>
+              <a:graphicFrameLocks noChangeAspect="1"/>
+            </wp:cNvGraphicFramePr>
+            <a:graphic>
+              <a:graphicData uri="http://schemas.openxmlformats.org/drawingml/2006/picture">
+                <pic:pic>
+                  <pic:nvPicPr>
+                    <pic:cNvPr id="0" name="04_junit_product-service.png"/>
+                    <pic:cNvPicPr/>
+                  </pic:nvPicPr>
+                  <pic:blipFill>
+                    <a:blip r:embed="rId13"/>
+                    <a:stretch>
+                      <a:fillRect/>
+                    </a:stretch>
+                  </pic:blipFill>
+                  <pic:spPr>
+                    <a:xfrm>
+                      <a:off x="0" y="0"/>
+                      <a:ext cx="5577840" cy="4183380"/>
+                    </a:xfrm>
+                    <a:prstGeom prst="rect"/>
+                  </pic:spPr>
+                </pic:pic>
+              </a:graphicData>
+            </a:graphic>
+          </wp:inline>
+        </w:drawing>
+      </w:r>
+    </w:p>
+    <w:p/>
+    <w:p>
+      <w:r>
+        <w:rPr>
+          <w:b/>
+          <w:sz w:val="24"/>
+        </w:rPr>
+        <w:t>Anexo 5 - Ejecucion real de las 4 pruebas Selenium (Chrome headless) contra el frontend: login valido/invalido, navegacion y logout.</w:t>
+      </w:r>
+    </w:p>
+    <w:p>
+      <w:pPr>
+        <w:jc w:val="center"/>
+      </w:pPr>
+      <w:r>
+        <w:drawing>
+          <wp:inline xmlns:a="http://schemas.openxmlformats.org/drawingml/2006/main" xmlns:pic="http://schemas.openxmlformats.org/drawingml/2006/picture">
+            <wp:extent cx="5577840" cy="3532632"/>
+            <wp:docPr id="5" name="Picture 5"/>
+            <wp:cNvGraphicFramePr>
+              <a:graphicFrameLocks noChangeAspect="1"/>
+            </wp:cNvGraphicFramePr>
+            <a:graphic>
+              <a:graphicData uri="http://schemas.openxmlformats.org/drawingml/2006/picture">
+                <pic:pic>
+                  <pic:nvPicPr>
+                    <pic:cNvPr id="0" name="05_selenium_tests.png"/>
+                    <pic:cNvPicPr/>
+                  </pic:nvPicPr>
+                  <pic:blipFill>
+                    <a:blip r:embed="rId14"/>
+                    <a:stretch>
+                      <a:fillRect/>
+                    </a:stretch>
+                  </pic:blipFill>
+                  <pic:spPr>
+                    <a:xfrm>
+                      <a:off x="0" y="0"/>
+                      <a:ext cx="5577840" cy="3532632"/>
+                    </a:xfrm>
+                    <a:prstGeom prst="rect"/>
+                  </pic:spPr>
+                </pic:pic>
+              </a:graphicData>
+            </a:graphic>
+          </wp:inline>
+        </w:drawing>
+      </w:r>
+    </w:p>
+    <w:p/>
+    <w:p>
+      <w:r>
+        <w:rPr>
+          <w:b/>
+          <w:sz w:val="24"/>
+        </w:rPr>
+        <w:t>Anexo 6 - Ejecucion real de la prueba de carga y estres con k6: 1.019 peticiones, 0% de error, p(95)=32,54 ms con 25 usuarios virtuales.</w:t>
+      </w:r>
+    </w:p>
+    <w:p>
+      <w:pPr>
+        <w:jc w:val="center"/>
+      </w:pPr>
+      <w:r>
+        <w:drawing>
+          <wp:inline xmlns:a="http://schemas.openxmlformats.org/drawingml/2006/main" xmlns:pic="http://schemas.openxmlformats.org/drawingml/2006/picture">
+            <wp:extent cx="5577840" cy="4183380"/>
+            <wp:docPr id="6" name="Picture 6"/>
+            <wp:cNvGraphicFramePr>
+              <a:graphicFrameLocks noChangeAspect="1"/>
+            </wp:cNvGraphicFramePr>
+            <a:graphic>
+              <a:graphicData uri="http://schemas.openxmlformats.org/drawingml/2006/picture">
+                <pic:pic>
+                  <pic:nvPicPr>
+                    <pic:cNvPr id="0" name="06_k6_carga_estres.png"/>
+                    <pic:cNvPicPr/>
+                  </pic:nvPicPr>
+                  <pic:blipFill>
+                    <a:blip r:embed="rId15"/>
+                    <a:stretch>
+                      <a:fillRect/>
+                    </a:stretch>
+                  </pic:blipFill>
+                  <pic:spPr>
+                    <a:xfrm>
+                      <a:off x="0" y="0"/>
+                      <a:ext cx="5577840" cy="4183380"/>
+                    </a:xfrm>
+                    <a:prstGeom prst="rect"/>
+                  </pic:spPr>
+                </pic:pic>
+              </a:graphicData>
+            </a:graphic>
+          </wp:inline>
+        </w:drawing>
+      </w:r>
+    </w:p>
+    <w:p/>
+    <w:p>
+      <w:r>
+        <w:rPr>
+          <w:b/>
+          <w:sz w:val="24"/>
+        </w:rPr>
+        <w:t>Anexo 7 - Dashboard real de SonarQube para auth-service (796 lineas de codigo, Quality Gate aprobado, 2 issues de seguridad abiertos, rating de seguridad E).</w:t>
+      </w:r>
+    </w:p>
+    <w:p>
+      <w:pPr>
+        <w:jc w:val="center"/>
+      </w:pPr>
+      <w:r>
+        <w:drawing>
+          <wp:inline xmlns:a="http://schemas.openxmlformats.org/drawingml/2006/main" xmlns:pic="http://schemas.openxmlformats.org/drawingml/2006/picture">
+            <wp:extent cx="5577840" cy="3422582"/>
+            <wp:docPr id="7" name="Picture 7"/>
+            <wp:cNvGraphicFramePr>
+              <a:graphicFrameLocks noChangeAspect="1"/>
+            </wp:cNvGraphicFramePr>
+            <a:graphic>
+              <a:graphicData uri="http://schemas.openxmlformats.org/drawingml/2006/picture">
+                <pic:pic>
+                  <pic:nvPicPr>
+                    <pic:cNvPr id="0" name="07_sonarqube_dashboard_auth-service.png"/>
+                    <pic:cNvPicPr/>
+                  </pic:nvPicPr>
+                  <pic:blipFill>
+                    <a:blip r:embed="rId16"/>
+                    <a:stretch>
+                      <a:fillRect/>
+                    </a:stretch>
+                  </pic:blipFill>
+                  <pic:spPr>
+                    <a:xfrm>
+                      <a:off x="0" y="0"/>
+                      <a:ext cx="5577840" cy="3422582"/>
+                    </a:xfrm>
+                    <a:prstGeom prst="rect"/>
+                  </pic:spPr>
+                </pic:pic>
+              </a:graphicData>
+            </a:graphic>
+          </wp:inline>
+        </w:drawing>
+      </w:r>
+    </w:p>
+    <w:p/>
+    <w:p>
+      <w:r>
+        <w:rPr>
+          <w:b/>
+          <w:sz w:val="24"/>
+        </w:rPr>
+        <w:t>Anexo 8 - Dashboard real de SonarQube para product-service (738 lineas de codigo, Quality Gate aprobado, 1 issue de seguridad abierto, rating de seguridad D).</w:t>
+      </w:r>
+    </w:p>
+    <w:p>
+      <w:pPr>
+        <w:jc w:val="center"/>
+      </w:pPr>
+      <w:r>
+        <w:drawing>
+          <wp:inline xmlns:a="http://schemas.openxmlformats.org/drawingml/2006/main" xmlns:pic="http://schemas.openxmlformats.org/drawingml/2006/picture">
+            <wp:extent cx="5577840" cy="3422582"/>
+            <wp:docPr id="8" name="Picture 8"/>
+            <wp:cNvGraphicFramePr>
+              <a:graphicFrameLocks noChangeAspect="1"/>
+            </wp:cNvGraphicFramePr>
+            <a:graphic>
+              <a:graphicData uri="http://schemas.openxmlformats.org/drawingml/2006/picture">
+                <pic:pic>
+                  <pic:nvPicPr>
+                    <pic:cNvPr id="0" name="08_sonarqube_dashboard_product-service.png"/>
+                    <pic:cNvPicPr/>
+                  </pic:nvPicPr>
+                  <pic:blipFill>
+                    <a:blip r:embed="rId17"/>
+                    <a:stretch>
+                      <a:fillRect/>
+                    </a:stretch>
+                  </pic:blipFill>
+                  <pic:spPr>
+                    <a:xfrm>
+                      <a:off x="0" y="0"/>
+                      <a:ext cx="5577840" cy="3422582"/>
+                    </a:xfrm>
+                    <a:prstGeom prst="rect"/>
+                  </pic:spPr>
+                </pic:pic>
+              </a:graphicData>
+            </a:graphic>
+          </wp:inline>
+        </w:drawing>
+      </w:r>
+    </w:p>
+    <w:p/>
+    <w:p>
+      <w:r>
+        <w:rPr>
+          <w:b/>
+          <w:sz w:val="24"/>
+        </w:rPr>
+        <w:t>Anexo 9 - Issues reales detectados por SonarQube en auth-service: la contrasena hardcodeada (BLOCKER, DataSeeder.java) y el uso de HMAC-SHA1 en TotpService (HIGH), ambos descritos en la seccion de Analisis Estatico de Codigo.</w:t>
+      </w:r>
+    </w:p>
+    <w:p>
+      <w:pPr>
+        <w:jc w:val="center"/>
+      </w:pPr>
+      <w:r>
+        <w:drawing>
+          <wp:inline xmlns:a="http://schemas.openxmlformats.org/drawingml/2006/main" xmlns:pic="http://schemas.openxmlformats.org/drawingml/2006/picture">
+            <wp:extent cx="5577840" cy="3422582"/>
+            <wp:docPr id="9" name="Picture 9"/>
+            <wp:cNvGraphicFramePr>
+              <a:graphicFrameLocks noChangeAspect="1"/>
+            </wp:cNvGraphicFramePr>
+            <a:graphic>
+              <a:graphicData uri="http://schemas.openxmlformats.org/drawingml/2006/picture">
+                <pic:pic>
+                  <pic:nvPicPr>
+                    <pic:cNvPr id="0" name="09_sonarqube_issues_auth-service.png"/>
+                    <pic:cNvPicPr/>
+                  </pic:nvPicPr>
+                  <pic:blipFill>
+                    <a:blip r:embed="rId18"/>
+                    <a:stretch>
+                      <a:fillRect/>
+                    </a:stretch>
+                  </pic:blipFill>
+                  <pic:spPr>
+                    <a:xfrm>
+                      <a:off x="0" y="0"/>
+                      <a:ext cx="5577840" cy="3422582"/>
+                    </a:xfrm>
+                    <a:prstGeom prst="rect"/>
+                  </pic:spPr>
+                </pic:pic>
+              </a:graphicData>
+            </a:graphic>
+          </wp:inline>
+        </w:drawing>
+      </w:r>
+    </w:p>
+    <w:p/>
     <w:sectPr>
       <w:headerReference w:type="first" r:id="rId7"/>
       <w:pgSz w:w="12242" w:h="15842" w:code="1"/>

</xml_diff>